<commit_message>
Revise plan to about 4 weeks and 2 sprints
- PRD: 2 sprints with 2 gates; lineage and dashboard become stretch items;
  week-4 squad swap removed; AI-assistant rule added
- READMEs: 4-week plan, stretch items marked

Co-Authored-By: Claude Sonnet 5 <noreply@anthropic.com>
</commit_message>
<xml_diff>
--- a/docs/CCAR_POC_PRD.docx
+++ b/docs/CCAR_POC_PRD.docx
@@ -39,7 +39,7 @@
         <w:t xml:space="preserve">StressLens</w:t>
       </w:r>
       <w:r>
-        <w:t xml:space="preserve"> is an 8-week internal practice project. About 40 Iris people build a small, simplified version of the stress test that big US banks run every year (CCAR), using made-up data for a fictional bank.</w:t>
+        <w:t xml:space="preserve"> is an 4-week internal practice project. About 40 Iris people build a small, simplified version of the stress test that big US banks run every year (CCAR), using made-up data for a fictional bank.</w:t>
       </w:r>
     </w:p>
     <w:p>
@@ -111,7 +111,7 @@
         <w:t xml:space="preserve">How it runs:</w:t>
       </w:r>
       <w:r>
-        <w:t xml:space="preserve"> 4 squads of about 10 people, each owning one layer of the pipeline, plus one shared BA. 6 hours a day for 8 weeks, free software only.</w:t>
+        <w:t xml:space="preserve"> 4 squads of about 10 people, each owning one layer of the pipeline, plus one shared BA. 6 hours a day for about 4 weeks, free software only.</w:t>
       </w:r>
     </w:p>
     <w:p>
@@ -505,7 +505,7 @@
           <w:p>
             <w:pPr/>
             <w:r>
-              <w:t xml:space="preserve">Live demo at end of week 8</w:t>
+              <w:t xml:space="preserve">Live demo at end of week 4</w:t>
             </w:r>
           </w:p>
         </w:tc>
@@ -3101,18 +3101,18 @@
           <w:p>
             <w:pPr/>
             <w:r>
-              <w:t xml:space="preserve">Scenarios, PD/LGD/EAD/loss, RWA, PPNR, capital, dashboard</w:t>
-            </w:r>
-          </w:p>
-        </w:tc>
-        <w:tc>
-          <w:tcPr>
-            <w:tcW w:w="1872" w:type="dxa"/>
-          </w:tcPr>
-          <w:p>
-            <w:pPr/>
-            <w:r>
-              <w:t xml:space="preserve">US-07, 08, 09, 15</w:t>
+              <w:t xml:space="preserve">Scenarios, PD/LGD/EAD/loss, RWA, PPNR, capital</w:t>
+            </w:r>
+          </w:p>
+        </w:tc>
+        <w:tc>
+          <w:tcPr>
+            <w:tcW w:w="1872" w:type="dxa"/>
+          </w:tcPr>
+          <w:p>
+            <w:pPr/>
+            <w:r>
+              <w:t xml:space="preserve">US-07, 08, 09</w:t>
             </w:r>
           </w:p>
         </w:tc>
@@ -3173,18 +3173,18 @@
           <w:p>
             <w:pPr/>
             <w:r>
-              <w:t xml:space="preserve">Loan report, capital summary, approval workflow, lineage</w:t>
-            </w:r>
-          </w:p>
-        </w:tc>
-        <w:tc>
-          <w:tcPr>
-            <w:tcW w:w="1872" w:type="dxa"/>
-          </w:tcPr>
-          <w:p>
-            <w:pPr/>
-            <w:r>
-              <w:t xml:space="preserve">US-11, 12, 14</w:t>
+              <w:t xml:space="preserve">Loan report, capital summary, approval workflow</w:t>
+            </w:r>
+          </w:p>
+        </w:tc>
+        <w:tc>
+          <w:tcPr>
+            <w:tcW w:w="1872" w:type="dxa"/>
+          </w:tcPr>
+          <w:p>
+            <w:pPr/>
+            <w:r>
+              <w:t xml:space="preserve">US-11, 12</w:t>
             </w:r>
           </w:p>
         </w:tc>
@@ -3221,7 +3221,7 @@
     <w:p>
       <w:pPr/>
       <w:r>
-        <w:t xml:space="preserve">Because squads B, C and D start from ready-made files, nobody waits for the squad before them. In Sprint 3 each squad switches to the real outputs of the squad upstream.</w:t>
+        <w:t xml:space="preserve">Because squads B, C and D start from ready-made files, nobody waits for the squad before them. In week 3 each squad switches to the real outputs of the squad upstream.</w:t>
       </w:r>
     </w:p>
     <w:p>
@@ -3302,7 +3302,7 @@
         </w:numPr>
       </w:pPr>
       <w:r>
-        <w:t xml:space="preserve">Estimated BA effort: 8–10 hours a week.</w:t>
+        <w:t xml:space="preserve">Estimated BA effort: 10–12 hours a week, heavier in the first two weeks.</w:t>
       </w:r>
     </w:p>
     <w:p>
@@ -3314,7 +3314,7 @@
         <w:t xml:space="preserve">Cross-learning.</w:t>
       </w:r>
       <w:r>
-        <w:t xml:space="preserve"> At week 4, two people per squad swap to another squad, so more people see two layers. A weekly one-hour “CCAR Hour” is open to all.</w:t>
+        <w:t xml:space="preserve"> A weekly one-hour “CCAR Hour” is open to all.</w:t>
       </w:r>
     </w:p>
     <w:p>
@@ -3322,13 +3322,13 @@
         <w:pStyle w:val="Heading2"/>
       </w:pPr>
       <w:r>
-        <w:t xml:space="preserve">9. Plan: 8 weeks, 4 sprints</w:t>
+        <w:t xml:space="preserve">9. Plan: about 4 weeks, 2 sprints</w:t>
       </w:r>
     </w:p>
     <w:p>
       <w:pPr/>
       <w:r>
-        <w:t xml:space="preserve">All four squads run the same four 2-week sprints in parallel. The BA checks each gate; if a gate is missed, the next sprint drops a lower-priority story instead of extending the timeline.</w:t>
+        <w:t xml:space="preserve">All four squads run the same two 2-week sprints in parallel. The BA checks each gate. If time runs short, drop the stretch items rather than extend the timeline.</w:t>
       </w:r>
     </w:p>
     <w:p>
@@ -3336,13 +3336,13 @@
       <w:r>
         <w:drawing>
           <wp:inline distT="0" distB="0" distL="0" distR="0">
-            <wp:extent cx="5486400" cy="1983921"/>
-            <wp:docPr id="2" name="image2" descr="Sprint roadmap · 4 sprints with exit gates"/>
+            <wp:extent cx="5486400" cy="1755321"/>
+            <wp:docPr id="2" name="image2" descr="Sprint roadmap · 2 sprints, 2 gates"/>
             <a:graphic xmlns:a="http://schemas.openxmlformats.org/drawingml/2006/main">
               <a:graphicData uri="http://schemas.openxmlformats.org/drawingml/2006/picture">
                 <pic:pic xmlns:pic="http://schemas.openxmlformats.org/drawingml/2006/picture">
                   <pic:nvPicPr>
-                    <pic:cNvPr id="2" name="image2" descr="Sprint roadmap · 4 sprints with exit gates"/>
+                    <pic:cNvPr id="2" name="image2" descr="Sprint roadmap · 2 sprints, 2 gates"/>
                     <pic:cNvPicPr/>
                   </pic:nvPicPr>
                   <pic:blipFill>
@@ -3354,7 +3354,7 @@
                   <pic:spPr>
                     <a:xfrm>
                       <a:off x="0" y="0"/>
-                      <a:ext cx="5486400" cy="1983921"/>
+                      <a:ext cx="5486400" cy="1755321"/>
                     </a:xfrm>
                     <a:prstGeom prst="rect">
                       <a:avLst/>
@@ -3370,7 +3370,7 @@
     <w:p>
       <w:pPr/>
       <w:r>
-        <w:t xml:space="preserve">Sprint roadmap · 4 sprints with exit gates</w:t>
+        <w:t xml:space="preserve">Sprint roadmap · 2 sprints, 2 gates</w:t>
       </w:r>
     </w:p>
     <w:tbl>
@@ -3445,18 +3445,18 @@
           <w:p>
             <w:pPr/>
             <w:r>
-              <w:t xml:space="preserve">Set up tools; build your layer against the ready-made inputs</w:t>
-            </w:r>
-          </w:p>
-        </w:tc>
-        <w:tc>
-          <w:tcPr>
-            <w:tcW w:w="3120" w:type="dxa"/>
-          </w:tcPr>
-          <w:p>
-            <w:pPr/>
-            <w:r>
-              <w:t xml:space="preserve">G1: your layer runs end to end on the sample files</w:t>
+              <w:t xml:space="preserve">Set up tools; build your layer against the ready-made inputs; write tests; log actions in the audit trail</w:t>
+            </w:r>
+          </w:p>
+        </w:tc>
+        <w:tc>
+          <w:tcPr>
+            <w:tcW w:w="3120" w:type="dxa"/>
+          </w:tcPr>
+          <w:p>
+            <w:pPr/>
+            <w:r>
+              <w:t xml:space="preserve">G1: output matches the answer key (A: 40 curated loans; B: 12 of 12 errors found; C: 120 results within $1; D: reports produced from provided results)</w:t>
             </w:r>
           </w:p>
         </w:tc>
@@ -3480,93 +3480,47 @@
           <w:p>
             <w:pPr/>
             <w:r>
-              <w:t xml:space="preserve">Finish the layer; write tests; log actions in the audit trail</w:t>
-            </w:r>
-          </w:p>
-        </w:tc>
-        <w:tc>
-          <w:tcPr>
-            <w:tcW w:w="3120" w:type="dxa"/>
-          </w:tcPr>
-          <w:p>
-            <w:pPr/>
-            <w:r>
-              <w:t xml:space="preserve">G2: output matches the answer key (A: 40 curated loans; B: 12 of 12 errors found; C: 120 results within $1; D: reports produced from provided results)</w:t>
-            </w:r>
-          </w:p>
-        </w:tc>
-      </w:tr>
-      <w:tr>
-        <w:tc>
-          <w:tcPr>
-            <w:tcW w:w="3120" w:type="dxa"/>
-          </w:tcPr>
-          <w:p>
-            <w:pPr/>
-            <w:r>
-              <w:t xml:space="preserve">3 (weeks 5–6)</w:t>
-            </w:r>
-          </w:p>
-        </w:tc>
-        <w:tc>
-          <w:tcPr>
-            <w:tcW w:w="3120" w:type="dxa"/>
-          </w:tcPr>
-          <w:p>
-            <w:pPr/>
-            <w:r>
-              <w:t xml:space="preserve">Connect to the real outputs of the upstream squad; fix mismatches</w:t>
-            </w:r>
-          </w:p>
-        </w:tc>
-        <w:tc>
-          <w:tcPr>
-            <w:tcW w:w="3120" w:type="dxa"/>
-          </w:tcPr>
-          <w:p>
-            <w:pPr/>
-            <w:r>
-              <w:t xml:space="preserve">G3: full run from raw files to report works</w:t>
-            </w:r>
-          </w:p>
-        </w:tc>
-      </w:tr>
-      <w:tr>
-        <w:tc>
-          <w:tcPr>
-            <w:tcW w:w="3120" w:type="dxa"/>
-          </w:tcPr>
-          <w:p>
-            <w:pPr/>
-            <w:r>
-              <w:t xml:space="preserve">4 (weeks 7–8)</w:t>
-            </w:r>
-          </w:p>
-        </w:tc>
-        <w:tc>
-          <w:tcPr>
-            <w:tcW w:w="3120" w:type="dxa"/>
-          </w:tcPr>
-          <w:p>
-            <w:pPr/>
-            <w:r>
-              <w:t xml:space="preserve">Fix defects, dry runs, prepare demo</w:t>
-            </w:r>
-          </w:p>
-        </w:tc>
-        <w:tc>
-          <w:tcPr>
-            <w:tcW w:w="3120" w:type="dxa"/>
-          </w:tcPr>
-          <w:p>
-            <w:pPr/>
-            <w:r>
-              <w:t xml:space="preserve">G4: live management demo</w:t>
+              <w:t xml:space="preserve">Connect to the real outputs of the upstream squad; run raw files to report; fix mismatches; dry runs; demo</w:t>
+            </w:r>
+          </w:p>
+        </w:tc>
+        <w:tc>
+          <w:tcPr>
+            <w:tcW w:w="3120" w:type="dxa"/>
+          </w:tcPr>
+          <w:p>
+            <w:pPr/>
+            <w:r>
+              <w:t xml:space="preserve">G2: full run works and the live demo is delivered</w:t>
             </w:r>
           </w:p>
         </w:tc>
       </w:tr>
     </w:tbl>
+    <w:p>
+      <w:pPr/>
+      <w:r>
+        <w:rPr>
+          <w:b/>
+        </w:rPr>
+        <w:t xml:space="preserve">Stretch items (only if time allows):</w:t>
+      </w:r>
+      <w:r>
+        <w:t xml:space="preserve"> lineage view (US-14) and scenario dashboard (US-15).</w:t>
+      </w:r>
+    </w:p>
+    <w:p>
+      <w:pPr/>
+      <w:r>
+        <w:rPr>
+          <w:b/>
+        </w:rPr>
+        <w:t xml:space="preserve">AI assistants</w:t>
+      </w:r>
+      <w:r>
+        <w:t xml:space="preserve"> (such as Copilot) may be used if Iris policy allows. Anyone must be able to explain their work, and the answer key decides what counts as done.</w:t>
+      </w:r>
+    </w:p>
     <w:p>
       <w:pPr>
         <w:pStyle w:val="Heading2"/>
@@ -3979,7 +3933,7 @@
           <w:p>
             <w:pPr/>
             <w:r>
-              <w:t xml:space="preserve">Full log for the run; click a report value to trace it to the source file</w:t>
+              <w:t xml:space="preserve">Full log for the run</w:t>
             </w:r>
           </w:p>
         </w:tc>
@@ -4187,7 +4141,7 @@
           <w:p>
             <w:pPr/>
             <w:r>
-              <w:t xml:space="preserve">Same inputs and answer key for all; shared interface files; Sprint 3 integration gate</w:t>
+              <w:t xml:space="preserve">Same inputs and answer key for all; shared interface files; integration check at the start of week 3</w:t>
             </w:r>
           </w:p>
         </w:tc>
@@ -4307,7 +4261,7 @@
         <w:t xml:space="preserve">Assumptions:</w:t>
       </w:r>
       <w:r>
-        <w:t xml:space="preserve"> about 40 people available 6 hours a day for 8 weeks; free open-source tools are acceptable (PostgreSQL, Python, Streamlit); all data and the bank are fictional; scenario settings are expert judgement, not model output; regulatory references are for orientation only and must be checked against current Federal Reserve rules before any real use.</w:t>
+        <w:t xml:space="preserve"> about 40 people available 6 hours a day for about 4 weeks; free open-source tools are acceptable (PostgreSQL, Python, Streamlit); all data and the bank are fictional; scenario settings are expert judgement, not model output; regulatory references are for orientation only and must be checked against current Federal Reserve rules before any real use.</w:t>
       </w:r>
     </w:p>
     <w:p>

</xml_diff>

<commit_message>
Add visual key-numbers strip and colored label legend to PRD
Co-Authored-By: Claude Sonnet 5 <noreply@anthropic.com>
</commit_message>
<xml_diff>
--- a/docs/CCAR_POC_PRD.docx
+++ b/docs/CCAR_POC_PRD.docx
@@ -40,6 +40,48 @@
       </w:r>
       <w:r>
         <w:t xml:space="preserve"> is an 4-week internal practice project. About 40 Iris people build a small, simplified version of the stress test that big US banks run every year (CCAR), using made-up data for a fictional bank.</w:t>
+      </w:r>
+    </w:p>
+    <w:p>
+      <w:pPr/>
+      <w:r>
+        <w:drawing>
+          <wp:inline distT="0" distB="0" distL="0" distR="0">
+            <wp:extent cx="5486400" cy="1632857"/>
+            <wp:docPr id="1" name="image1" descr="StressLens at a glance"/>
+            <a:graphic xmlns:a="http://schemas.openxmlformats.org/drawingml/2006/main">
+              <a:graphicData uri="http://schemas.openxmlformats.org/drawingml/2006/picture">
+                <pic:pic xmlns:pic="http://schemas.openxmlformats.org/drawingml/2006/picture">
+                  <pic:nvPicPr>
+                    <pic:cNvPr id="1" name="image1" descr="StressLens at a glance"/>
+                    <pic:cNvPicPr/>
+                  </pic:nvPicPr>
+                  <pic:blipFill>
+                    <a:blip r:embed="rId3"/>
+                    <a:stretch>
+                      <a:fillRect/>
+                    </a:stretch>
+                  </pic:blipFill>
+                  <pic:spPr>
+                    <a:xfrm>
+                      <a:off x="0" y="0"/>
+                      <a:ext cx="5486400" cy="1632857"/>
+                    </a:xfrm>
+                    <a:prstGeom prst="rect">
+                      <a:avLst/>
+                    </a:prstGeom>
+                  </pic:spPr>
+                </pic:pic>
+              </a:graphicData>
+            </a:graphic>
+          </wp:inline>
+        </w:drawing>
+      </w:r>
+    </w:p>
+    <w:p>
+      <w:pPr/>
+      <w:r>
+        <w:t xml:space="preserve">StressLens at a glance</w:t>
       </w:r>
     </w:p>
     <w:p>
@@ -135,40 +177,43 @@
     <w:p>
       <w:pPr/>
       <w:r>
-        <w:rPr>
-          <w:b/>
-        </w:rPr>
-        <w:t xml:space="preserve">Labels used everywhere:</w:t>
-      </w:r>
-      <w:r>
-        <w:t xml:space="preserve"> </w:t>
-      </w:r>
-      <w:r>
-        <w:rPr>
-          <w:b/>
-        </w:rPr>
-        <w:t xml:space="preserve">[CCAR]</w:t>
-      </w:r>
-      <w:r>
-        <w:t xml:space="preserve"> = a real concept used by real banks. </w:t>
-      </w:r>
-      <w:r>
-        <w:rPr>
-          <w:b/>
-        </w:rPr>
-        <w:t xml:space="preserve">[POC]</w:t>
-      </w:r>
-      <w:r>
-        <w:t xml:space="preserve"> = something we simplified for practice. </w:t>
-      </w:r>
-      <w:r>
-        <w:rPr>
-          <w:b/>
-        </w:rPr>
-        <w:t xml:space="preserve">[ASSUMPTION]</w:t>
-      </w:r>
-      <w:r>
-        <w:t xml:space="preserve"> = a number we made up so we can proceed.</w:t>
+        <w:drawing>
+          <wp:inline distT="0" distB="0" distL="0" distR="0">
+            <wp:extent cx="5486400" cy="1632857"/>
+            <wp:docPr id="2" name="image2" descr="How to read the labels in this PRD"/>
+            <a:graphic xmlns:a="http://schemas.openxmlformats.org/drawingml/2006/main">
+              <a:graphicData uri="http://schemas.openxmlformats.org/drawingml/2006/picture">
+                <pic:pic xmlns:pic="http://schemas.openxmlformats.org/drawingml/2006/picture">
+                  <pic:nvPicPr>
+                    <pic:cNvPr id="2" name="image2" descr="How to read the labels in this PRD"/>
+                    <pic:cNvPicPr/>
+                  </pic:nvPicPr>
+                  <pic:blipFill>
+                    <a:blip r:embed="rId4"/>
+                    <a:stretch>
+                      <a:fillRect/>
+                    </a:stretch>
+                  </pic:blipFill>
+                  <pic:spPr>
+                    <a:xfrm>
+                      <a:off x="0" y="0"/>
+                      <a:ext cx="5486400" cy="1632857"/>
+                    </a:xfrm>
+                    <a:prstGeom prst="rect">
+                      <a:avLst/>
+                    </a:prstGeom>
+                  </pic:spPr>
+                </pic:pic>
+              </a:graphicData>
+            </a:graphic>
+          </wp:inline>
+        </w:drawing>
+      </w:r>
+    </w:p>
+    <w:p>
+      <w:pPr/>
+      <w:r>
+        <w:t xml:space="preserve">How to read the labels in this PRD</w:t>
       </w:r>
     </w:p>
     <w:p>
@@ -748,16 +793,16 @@
         <w:drawing>
           <wp:inline distT="0" distB="0" distL="0" distR="0">
             <wp:extent cx="5486400" cy="2735035"/>
-            <wp:docPr id="1" name="image1" descr="StressLens data flow · files to approved report"/>
+            <wp:docPr id="3" name="image3" descr="StressLens data flow · files to approved report"/>
             <a:graphic xmlns:a="http://schemas.openxmlformats.org/drawingml/2006/main">
               <a:graphicData uri="http://schemas.openxmlformats.org/drawingml/2006/picture">
                 <pic:pic xmlns:pic="http://schemas.openxmlformats.org/drawingml/2006/picture">
                   <pic:nvPicPr>
-                    <pic:cNvPr id="1" name="image1" descr="StressLens data flow · files to approved report"/>
+                    <pic:cNvPr id="3" name="image3" descr="StressLens data flow · files to approved report"/>
                     <pic:cNvPicPr/>
                   </pic:nvPicPr>
                   <pic:blipFill>
-                    <a:blip r:embed="rId3"/>
+                    <a:blip r:embed="rId5"/>
                     <a:stretch>
                       <a:fillRect/>
                     </a:stretch>
@@ -3337,16 +3382,16 @@
         <w:drawing>
           <wp:inline distT="0" distB="0" distL="0" distR="0">
             <wp:extent cx="5486400" cy="1755321"/>
-            <wp:docPr id="2" name="image2" descr="Sprint roadmap · 2 sprints, 2 gates"/>
+            <wp:docPr id="4" name="image4" descr="Sprint roadmap · 2 sprints, 2 gates"/>
             <a:graphic xmlns:a="http://schemas.openxmlformats.org/drawingml/2006/main">
               <a:graphicData uri="http://schemas.openxmlformats.org/drawingml/2006/picture">
                 <pic:pic xmlns:pic="http://schemas.openxmlformats.org/drawingml/2006/picture">
                   <pic:nvPicPr>
-                    <pic:cNvPr id="2" name="image2" descr="Sprint roadmap · 2 sprints, 2 gates"/>
+                    <pic:cNvPr id="4" name="image4" descr="Sprint roadmap · 2 sprints, 2 gates"/>
                     <pic:cNvPicPr/>
                   </pic:nvPicPr>
                   <pic:blipFill>
-                    <a:blip r:embed="rId4"/>
+                    <a:blip r:embed="rId6"/>
                     <a:stretch>
                       <a:fillRect/>
                     </a:stretch>

</xml_diff>